<commit_message>
checkpoint before checking out claude/intelligent-troubleshooting-design
</commit_message>
<xml_diff>
--- a/docs/intelligent-troubleshooting/submission/MateClaw智能排障-作品方案.docx
+++ b/docs/intelligent-troubleshooting/submission/MateClaw智能排障-作品方案.docx
@@ -44,7 +44,7 @@
           <w:color w:val="DD704B"/>
           <w:sz w:val="30"/>
         </w:rPr>
-        <w:t>让每一次排障都有证据、有过程、可复核</w:t>
+        <w:t>让排障能力不再只掌握在少数熟手手里</w:t>
       </w:r>
     </w:p>
     <w:p>
@@ -329,7 +329,7 @@
               <w:spacing w:after="0"/>
             </w:pPr>
             <w:r>
-              <w:t>2026-08-10</w:t>
+              <w:t>2026-08-11</w:t>
             </w:r>
           </w:p>
         </w:tc>
@@ -385,7 +385,7 @@
               <w:spacing w:after="0"/>
             </w:pPr>
             <w:r>
-              <w:t>MateClaw 不是把大模型接到日志搜索框，而是把真实只读取证、审核规则、确定性判断和人工处置串成一条可审计证据链。</w:t>
+              <w:t>MateClaw 让二线能够基于平台开展标准化排障，让三线开发快速进入陌生系统的有效调查，并在重大故障中帮助开发团队基于同一份证据快速收敛问题范围。</w:t>
             </w:r>
           </w:p>
         </w:tc>
@@ -433,7 +433,7 @@
           <w:rFonts w:ascii="Arial Unicode MS" w:hAnsi="Arial Unicode MS" w:eastAsia="Arial Unicode MS" w:hint="eastAsia"/>
           <w:b w:val="0"/>
         </w:rPr>
-        <w:t>MateClaw 智能排障把线上告警转化为一张可追溯的排障单：系统依据审核过的排障方法，从观测云连续读取失败请求、关联日志和正常请求对照，用确定性规则形成可复核结论，再由负责人确认和处置。</w:t>
+        <w:t>MateClaw 智能排障首先解决三个真实问题：二线看到告警却不知道下一步怎么查；三线开发接手陌生系统时过度依赖少数熟手；重大故障中多人重复查询、判断口径不一，问题范围迟迟无法收敛。平台把已经验证的调查方法、真实证据和人工责任边界放进同一张排障单。</w:t>
       </w:r>
     </w:p>
     <w:tbl>
@@ -1008,7 +1008,727 @@
         <w:pStyle w:val="Heading2"/>
       </w:pPr>
       <w:r>
-        <w:t>1.1 业务痛点</w:t>
+        <w:t>1.1 项目要解决的三个真实问题</w:t>
+      </w:r>
+    </w:p>
+    <w:tbl>
+      <w:tblPr>
+        <w:tblStyle w:val="TableGrid"/>
+        <w:tblW w:type="auto" w:w="0"/>
+        <w:jc w:val="center"/>
+        <w:tblLayout w:type="fixed"/>
+        <w:tblLook w:firstColumn="1" w:firstRow="1" w:lastColumn="0" w:lastRow="0" w:noHBand="0" w:noVBand="1" w:val="04A0"/>
+      </w:tblPr>
+      <w:tblGrid>
+        <w:gridCol w:w="3120"/>
+        <w:gridCol w:w="3120"/>
+        <w:gridCol w:w="3120"/>
+      </w:tblGrid>
+      <w:tr>
+        <w:trPr>
+          <w:tblHeader w:val="true"/>
+        </w:trPr>
+        <w:tc>
+          <w:tcPr>
+            <w:tcW w:type="dxa" w:w="1800"/>
+            <w:shd w:fill="F4F6F9"/>
+            <w:tcMar>
+              <w:top w:w="80" w:type="dxa"/>
+              <w:start w:w="120" w:type="dxa"/>
+              <w:bottom w:w="80" w:type="dxa"/>
+              <w:end w:w="120" w:type="dxa"/>
+            </w:tcMar>
+            <w:vAlign w:val="center"/>
+          </w:tcPr>
+          <w:p>
+            <w:pPr>
+              <w:jc w:val="left"/>
+            </w:pPr>
+            <w:r>
+              <w:rPr>
+                <w:b/>
+                <w:sz w:val="17"/>
+              </w:rPr>
+              <w:t>使用者 / 场景</w:t>
+            </w:r>
+          </w:p>
+        </w:tc>
+        <w:tc>
+          <w:tcPr>
+            <w:tcW w:type="dxa" w:w="3744"/>
+            <w:shd w:fill="F4F6F9"/>
+            <w:tcMar>
+              <w:top w:w="80" w:type="dxa"/>
+              <w:start w:w="120" w:type="dxa"/>
+              <w:bottom w:w="80" w:type="dxa"/>
+              <w:end w:w="120" w:type="dxa"/>
+            </w:tcMar>
+            <w:vAlign w:val="center"/>
+          </w:tcPr>
+          <w:p>
+            <w:pPr>
+              <w:jc w:val="left"/>
+            </w:pPr>
+            <w:r>
+              <w:rPr>
+                <w:b/>
+                <w:sz w:val="17"/>
+              </w:rPr>
+              <w:t>现在遇到的问题</w:t>
+            </w:r>
+          </w:p>
+        </w:tc>
+        <w:tc>
+          <w:tcPr>
+            <w:tcW w:type="dxa" w:w="3816"/>
+            <w:shd w:fill="F4F6F9"/>
+            <w:tcMar>
+              <w:top w:w="80" w:type="dxa"/>
+              <w:start w:w="120" w:type="dxa"/>
+              <w:bottom w:w="80" w:type="dxa"/>
+              <w:end w:w="120" w:type="dxa"/>
+            </w:tcMar>
+            <w:vAlign w:val="center"/>
+          </w:tcPr>
+          <w:p>
+            <w:pPr>
+              <w:jc w:val="left"/>
+            </w:pPr>
+            <w:r>
+              <w:rPr>
+                <w:b/>
+                <w:sz w:val="17"/>
+              </w:rPr>
+              <w:t>平台首先要交付的结果</w:t>
+            </w:r>
+          </w:p>
+        </w:tc>
+      </w:tr>
+      <w:tr>
+        <w:tc>
+          <w:tcPr>
+            <w:tcW w:type="dxa" w:w="1800"/>
+            <w:tcMar>
+              <w:top w:w="80" w:type="dxa"/>
+              <w:start w:w="120" w:type="dxa"/>
+              <w:bottom w:w="80" w:type="dxa"/>
+              <w:end w:w="120" w:type="dxa"/>
+            </w:tcMar>
+            <w:vAlign w:val="top"/>
+          </w:tcPr>
+          <w:p>
+            <w:pPr>
+              <w:spacing w:after="0"/>
+            </w:pPr>
+            <w:r>
+              <w:rPr>
+                <w:rFonts w:ascii="Arial Unicode MS" w:hAnsi="Arial Unicode MS" w:eastAsia="Arial Unicode MS" w:hint="eastAsia"/>
+                <w:sz w:val="17"/>
+              </w:rPr>
+              <w:t>二线</w:t>
+            </w:r>
+          </w:p>
+        </w:tc>
+        <w:tc>
+          <w:tcPr>
+            <w:tcW w:type="dxa" w:w="3744"/>
+            <w:tcMar>
+              <w:top w:w="80" w:type="dxa"/>
+              <w:start w:w="120" w:type="dxa"/>
+              <w:bottom w:w="80" w:type="dxa"/>
+              <w:end w:w="120" w:type="dxa"/>
+            </w:tcMar>
+            <w:vAlign w:val="top"/>
+          </w:tcPr>
+          <w:p>
+            <w:pPr>
+              <w:spacing w:after="0"/>
+            </w:pPr>
+            <w:r>
+              <w:rPr>
+                <w:rFonts w:ascii="Arial Unicode MS" w:hAnsi="Arial Unicode MS" w:eastAsia="Arial Unicode MS" w:hint="eastAsia"/>
+                <w:sz w:val="17"/>
+              </w:rPr>
+              <w:t>看到告警现象，但不知道该查什么、如何判断</w:t>
+            </w:r>
+          </w:p>
+        </w:tc>
+        <w:tc>
+          <w:tcPr>
+            <w:tcW w:type="dxa" w:w="3816"/>
+            <w:tcMar>
+              <w:top w:w="80" w:type="dxa"/>
+              <w:start w:w="120" w:type="dxa"/>
+              <w:bottom w:w="80" w:type="dxa"/>
+              <w:end w:w="120" w:type="dxa"/>
+            </w:tcMar>
+            <w:vAlign w:val="top"/>
+          </w:tcPr>
+          <w:p>
+            <w:pPr>
+              <w:spacing w:after="0"/>
+            </w:pPr>
+            <w:r>
+              <w:rPr>
+                <w:rFonts w:ascii="Arial Unicode MS" w:hAnsi="Arial Unicode MS" w:eastAsia="Arial Unicode MS" w:hint="eastAsia"/>
+                <w:sz w:val="17"/>
+              </w:rPr>
+              <w:t>按已审核方法启动并推进只读调查；证据不足时说清缺什么、为什么升级</w:t>
+            </w:r>
+          </w:p>
+        </w:tc>
+      </w:tr>
+      <w:tr>
+        <w:tc>
+          <w:tcPr>
+            <w:tcW w:type="dxa" w:w="1800"/>
+            <w:tcMar>
+              <w:top w:w="80" w:type="dxa"/>
+              <w:start w:w="120" w:type="dxa"/>
+              <w:bottom w:w="80" w:type="dxa"/>
+              <w:end w:w="120" w:type="dxa"/>
+            </w:tcMar>
+            <w:vAlign w:val="top"/>
+          </w:tcPr>
+          <w:p>
+            <w:pPr>
+              <w:spacing w:after="0"/>
+            </w:pPr>
+            <w:r>
+              <w:rPr>
+                <w:rFonts w:ascii="Arial Unicode MS" w:hAnsi="Arial Unicode MS" w:eastAsia="Arial Unicode MS" w:hint="eastAsia"/>
+                <w:sz w:val="17"/>
+              </w:rPr>
+              <w:t>三线开发</w:t>
+            </w:r>
+          </w:p>
+        </w:tc>
+        <w:tc>
+          <w:tcPr>
+            <w:tcW w:type="dxa" w:w="3744"/>
+            <w:tcMar>
+              <w:top w:w="80" w:type="dxa"/>
+              <w:start w:w="120" w:type="dxa"/>
+              <w:bottom w:w="80" w:type="dxa"/>
+              <w:end w:w="120" w:type="dxa"/>
+            </w:tcMar>
+            <w:vAlign w:val="top"/>
+          </w:tcPr>
+          <w:p>
+            <w:pPr>
+              <w:spacing w:after="0"/>
+            </w:pPr>
+            <w:r>
+              <w:rPr>
+                <w:rFonts w:ascii="Arial Unicode MS" w:hAnsi="Arial Unicode MS" w:eastAsia="Arial Unicode MS" w:hint="eastAsia"/>
+                <w:sz w:val="17"/>
+              </w:rPr>
+              <w:t>接手陌生系统时不熟悉字段、关联 ID 和历史经验，排障依赖少数熟手</w:t>
+            </w:r>
+          </w:p>
+        </w:tc>
+        <w:tc>
+          <w:tcPr>
+            <w:tcW w:type="dxa" w:w="3816"/>
+            <w:tcMar>
+              <w:top w:w="80" w:type="dxa"/>
+              <w:start w:w="120" w:type="dxa"/>
+              <w:bottom w:w="80" w:type="dxa"/>
+              <w:end w:w="120" w:type="dxa"/>
+            </w:tcMar>
+            <w:vAlign w:val="top"/>
+          </w:tcPr>
+          <w:p>
+            <w:pPr>
+              <w:spacing w:after="0"/>
+            </w:pPr>
+            <w:r>
+              <w:rPr>
+                <w:rFonts w:ascii="Arial Unicode MS" w:hAnsi="Arial Unicode MS" w:eastAsia="Arial Unicode MS" w:hint="eastAsia"/>
+                <w:sz w:val="17"/>
+              </w:rPr>
+              <w:t>先获得清晰调查路径、证据和结论，降低对系统熟悉度与个人经验的依赖</w:t>
+            </w:r>
+          </w:p>
+        </w:tc>
+      </w:tr>
+      <w:tr>
+        <w:tc>
+          <w:tcPr>
+            <w:tcW w:type="dxa" w:w="1800"/>
+            <w:tcMar>
+              <w:top w:w="80" w:type="dxa"/>
+              <w:start w:w="120" w:type="dxa"/>
+              <w:bottom w:w="80" w:type="dxa"/>
+              <w:end w:w="120" w:type="dxa"/>
+            </w:tcMar>
+            <w:vAlign w:val="top"/>
+          </w:tcPr>
+          <w:p>
+            <w:pPr>
+              <w:spacing w:after="0"/>
+            </w:pPr>
+            <w:r>
+              <w:rPr>
+                <w:rFonts w:ascii="Arial Unicode MS" w:hAnsi="Arial Unicode MS" w:eastAsia="Arial Unicode MS" w:hint="eastAsia"/>
+                <w:sz w:val="17"/>
+              </w:rPr>
+              <w:t>重大故障团队</w:t>
+            </w:r>
+          </w:p>
+        </w:tc>
+        <w:tc>
+          <w:tcPr>
+            <w:tcW w:type="dxa" w:w="3744"/>
+            <w:tcMar>
+              <w:top w:w="80" w:type="dxa"/>
+              <w:start w:w="120" w:type="dxa"/>
+              <w:bottom w:w="80" w:type="dxa"/>
+              <w:end w:w="120" w:type="dxa"/>
+            </w:tcMar>
+            <w:vAlign w:val="top"/>
+          </w:tcPr>
+          <w:p>
+            <w:pPr>
+              <w:spacing w:after="0"/>
+            </w:pPr>
+            <w:r>
+              <w:rPr>
+                <w:rFonts w:ascii="Arial Unicode MS" w:hAnsi="Arial Unicode MS" w:eastAsia="Arial Unicode MS" w:hint="eastAsia"/>
+                <w:sz w:val="17"/>
+              </w:rPr>
+              <w:t>多人重复查询、信息口径不一，异常与故障的关系难以确认</w:t>
+            </w:r>
+          </w:p>
+        </w:tc>
+        <w:tc>
+          <w:tcPr>
+            <w:tcW w:type="dxa" w:w="3816"/>
+            <w:tcMar>
+              <w:top w:w="80" w:type="dxa"/>
+              <w:start w:w="120" w:type="dxa"/>
+              <w:bottom w:w="80" w:type="dxa"/>
+              <w:end w:w="120" w:type="dxa"/>
+            </w:tcMar>
+            <w:vAlign w:val="top"/>
+          </w:tcPr>
+          <w:p>
+            <w:pPr>
+              <w:spacing w:after="0"/>
+            </w:pPr>
+            <w:r>
+              <w:rPr>
+                <w:rFonts w:ascii="Arial Unicode MS" w:hAnsi="Arial Unicode MS" w:eastAsia="Arial Unicode MS" w:hint="eastAsia"/>
+                <w:sz w:val="17"/>
+              </w:rPr>
+              <w:t>统一证据、判断口径和责任边界，快速收敛问题范围并减少无效沟通</w:t>
+            </w:r>
+          </w:p>
+        </w:tc>
+      </w:tr>
+    </w:tbl>
+    <w:p>
+      <w:pPr>
+        <w:spacing w:after="40"/>
+      </w:pPr>
+    </w:p>
+    <w:tbl>
+      <w:tblPr>
+        <w:tblW w:type="auto" w:w="0"/>
+        <w:jc w:val="center"/>
+        <w:tblLayout w:type="fixed"/>
+        <w:tblLook w:firstColumn="1" w:firstRow="1" w:lastColumn="0" w:lastRow="0" w:noHBand="0" w:noVBand="1" w:val="04A0"/>
+      </w:tblPr>
+      <w:tblGrid>
+        <w:gridCol w:w="9360"/>
+      </w:tblGrid>
+      <w:tr>
+        <w:tc>
+          <w:tcPr>
+            <w:tcW w:type="dxa" w:w="9360"/>
+            <w:shd w:fill="F4F6F9"/>
+            <w:tcMar>
+              <w:top w:w="150" w:type="dxa"/>
+              <w:start w:w="180" w:type="dxa"/>
+              <w:bottom w:w="150" w:type="dxa"/>
+              <w:end w:w="180" w:type="dxa"/>
+            </w:tcMar>
+          </w:tcPr>
+          <w:p>
+            <w:pPr>
+              <w:spacing w:after="80"/>
+            </w:pPr>
+            <w:r>
+              <w:rPr>
+                <w:b/>
+                <w:color w:val="2E74B5"/>
+              </w:rPr>
+              <w:t>不是降低开发要求</w:t>
+            </w:r>
+          </w:p>
+          <w:p>
+            <w:pPr>
+              <w:spacing w:after="0"/>
+            </w:pPr>
+            <w:r>
+              <w:t>平台降低的是排障对系统熟悉度、少数专家和个人记忆的依赖；真实字段核对、最终因果确认和生产处置仍由授权人员负责。</w:t>
+            </w:r>
+          </w:p>
+        </w:tc>
+      </w:tr>
+    </w:tbl>
+    <w:p>
+      <w:pPr>
+        <w:spacing w:after="40"/>
+      </w:pPr>
+    </w:p>
+    <w:p>
+      <w:pPr>
+        <w:pStyle w:val="Heading2"/>
+      </w:pPr>
+      <w:r>
+        <w:t>1.2 三个问题与三种处理方式不能混为一谈</w:t>
+      </w:r>
+    </w:p>
+    <w:p>
+      <w:pPr>
+        <w:spacing w:after="160"/>
+      </w:pPr>
+      <w:r>
+        <w:rPr>
+          <w:rFonts w:ascii="Arial Unicode MS" w:hAnsi="Arial Unicode MS" w:eastAsia="Arial Unicode MS" w:hint="eastAsia"/>
+          <w:b w:val="0"/>
+        </w:rPr>
+        <w:t>三个问题说的是作品要交付的业务结果；三种处理方式说的是平台面对不同成熟度场景时的工作方式。</w:t>
+      </w:r>
+    </w:p>
+    <w:tbl>
+      <w:tblPr>
+        <w:tblStyle w:val="TableGrid"/>
+        <w:tblW w:type="auto" w:w="0"/>
+        <w:jc w:val="center"/>
+        <w:tblLayout w:type="fixed"/>
+        <w:tblLook w:firstColumn="1" w:firstRow="1" w:lastColumn="0" w:lastRow="0" w:noHBand="0" w:noVBand="1" w:val="04A0"/>
+      </w:tblPr>
+      <w:tblGrid>
+        <w:gridCol w:w="3120"/>
+        <w:gridCol w:w="3120"/>
+        <w:gridCol w:w="3120"/>
+      </w:tblGrid>
+      <w:tr>
+        <w:trPr>
+          <w:tblHeader w:val="true"/>
+        </w:trPr>
+        <w:tc>
+          <w:tcPr>
+            <w:tcW w:type="dxa" w:w="2088"/>
+            <w:shd w:fill="F4F6F9"/>
+            <w:tcMar>
+              <w:top w:w="80" w:type="dxa"/>
+              <w:start w:w="120" w:type="dxa"/>
+              <w:bottom w:w="80" w:type="dxa"/>
+              <w:end w:w="120" w:type="dxa"/>
+            </w:tcMar>
+            <w:vAlign w:val="center"/>
+          </w:tcPr>
+          <w:p>
+            <w:pPr>
+              <w:jc w:val="left"/>
+            </w:pPr>
+            <w:r>
+              <w:rPr>
+                <w:b/>
+                <w:sz w:val="17"/>
+              </w:rPr>
+              <w:t>场景成熟度</w:t>
+            </w:r>
+          </w:p>
+        </w:tc>
+        <w:tc>
+          <w:tcPr>
+            <w:tcW w:type="dxa" w:w="4680"/>
+            <w:shd w:fill="F4F6F9"/>
+            <w:tcMar>
+              <w:top w:w="80" w:type="dxa"/>
+              <w:start w:w="120" w:type="dxa"/>
+              <w:bottom w:w="80" w:type="dxa"/>
+              <w:end w:w="120" w:type="dxa"/>
+            </w:tcMar>
+            <w:vAlign w:val="center"/>
+          </w:tcPr>
+          <w:p>
+            <w:pPr>
+              <w:jc w:val="left"/>
+            </w:pPr>
+            <w:r>
+              <w:rPr>
+                <w:b/>
+                <w:sz w:val="17"/>
+              </w:rPr>
+              <w:t>平台怎么做</w:t>
+            </w:r>
+          </w:p>
+        </w:tc>
+        <w:tc>
+          <w:tcPr>
+            <w:tcW w:type="dxa" w:w="2592"/>
+            <w:shd w:fill="F4F6F9"/>
+            <w:tcMar>
+              <w:top w:w="80" w:type="dxa"/>
+              <w:start w:w="120" w:type="dxa"/>
+              <w:bottom w:w="80" w:type="dxa"/>
+              <w:end w:w="120" w:type="dxa"/>
+            </w:tcMar>
+            <w:vAlign w:val="center"/>
+          </w:tcPr>
+          <w:p>
+            <w:pPr>
+              <w:jc w:val="left"/>
+            </w:pPr>
+            <w:r>
+              <w:rPr>
+                <w:b/>
+                <w:sz w:val="17"/>
+              </w:rPr>
+              <w:t>当前状态</w:t>
+            </w:r>
+          </w:p>
+        </w:tc>
+      </w:tr>
+      <w:tr>
+        <w:tc>
+          <w:tcPr>
+            <w:tcW w:type="dxa" w:w="2088"/>
+            <w:tcMar>
+              <w:top w:w="80" w:type="dxa"/>
+              <w:start w:w="120" w:type="dxa"/>
+              <w:bottom w:w="80" w:type="dxa"/>
+              <w:end w:w="120" w:type="dxa"/>
+            </w:tcMar>
+            <w:vAlign w:val="top"/>
+          </w:tcPr>
+          <w:p>
+            <w:pPr>
+              <w:spacing w:after="0"/>
+            </w:pPr>
+            <w:r>
+              <w:rPr>
+                <w:rFonts w:ascii="Arial Unicode MS" w:hAnsi="Arial Unicode MS" w:eastAsia="Arial Unicode MS" w:hint="eastAsia"/>
+                <w:sz w:val="17"/>
+              </w:rPr>
+              <w:t>已有审核方法</w:t>
+            </w:r>
+          </w:p>
+        </w:tc>
+        <w:tc>
+          <w:tcPr>
+            <w:tcW w:type="dxa" w:w="4680"/>
+            <w:tcMar>
+              <w:top w:w="80" w:type="dxa"/>
+              <w:start w:w="120" w:type="dxa"/>
+              <w:bottom w:w="80" w:type="dxa"/>
+              <w:end w:w="120" w:type="dxa"/>
+            </w:tcMar>
+            <w:vAlign w:val="top"/>
+          </w:tcPr>
+          <w:p>
+            <w:pPr>
+              <w:spacing w:after="0"/>
+            </w:pPr>
+            <w:r>
+              <w:rPr>
+                <w:rFonts w:ascii="Arial Unicode MS" w:hAnsi="Arial Unicode MS" w:eastAsia="Arial Unicode MS" w:hint="eastAsia"/>
+                <w:sz w:val="17"/>
+              </w:rPr>
+              <w:t>直接执行冻结查询和确定性条件</w:t>
+            </w:r>
+          </w:p>
+        </w:tc>
+        <w:tc>
+          <w:tcPr>
+            <w:tcW w:type="dxa" w:w="2592"/>
+            <w:tcMar>
+              <w:top w:w="80" w:type="dxa"/>
+              <w:start w:w="120" w:type="dxa"/>
+              <w:bottom w:w="80" w:type="dxa"/>
+              <w:end w:w="120" w:type="dxa"/>
+            </w:tcMar>
+            <w:vAlign w:val="top"/>
+          </w:tcPr>
+          <w:p>
+            <w:pPr>
+              <w:spacing w:after="0"/>
+            </w:pPr>
+            <w:r>
+              <w:rPr>
+                <w:rFonts w:ascii="Arial Unicode MS" w:hAnsi="Arial Unicode MS" w:eastAsia="Arial Unicode MS" w:hint="eastAsia"/>
+                <w:sz w:val="17"/>
+              </w:rPr>
+              <w:t>ITGW 904003 真实案例已跑通</w:t>
+            </w:r>
+          </w:p>
+        </w:tc>
+      </w:tr>
+      <w:tr>
+        <w:tc>
+          <w:tcPr>
+            <w:tcW w:type="dxa" w:w="2088"/>
+            <w:tcMar>
+              <w:top w:w="80" w:type="dxa"/>
+              <w:start w:w="120" w:type="dxa"/>
+              <w:bottom w:w="80" w:type="dxa"/>
+              <w:end w:w="120" w:type="dxa"/>
+            </w:tcMar>
+            <w:vAlign w:val="top"/>
+          </w:tcPr>
+          <w:p>
+            <w:pPr>
+              <w:spacing w:after="0"/>
+            </w:pPr>
+            <w:r>
+              <w:rPr>
+                <w:rFonts w:ascii="Arial Unicode MS" w:hAnsi="Arial Unicode MS" w:eastAsia="Arial Unicode MS" w:hint="eastAsia"/>
+                <w:sz w:val="17"/>
+              </w:rPr>
+              <w:t>新问题已由人解决</w:t>
+            </w:r>
+          </w:p>
+        </w:tc>
+        <w:tc>
+          <w:tcPr>
+            <w:tcW w:type="dxa" w:w="4680"/>
+            <w:tcMar>
+              <w:top w:w="80" w:type="dxa"/>
+              <w:start w:w="120" w:type="dxa"/>
+              <w:bottom w:w="80" w:type="dxa"/>
+              <w:end w:w="120" w:type="dxa"/>
+            </w:tcMar>
+            <w:vAlign w:val="top"/>
+          </w:tcPr>
+          <w:p>
+            <w:pPr>
+              <w:spacing w:after="0"/>
+            </w:pPr>
+            <w:r>
+              <w:rPr>
+                <w:rFonts w:ascii="Arial Unicode MS" w:hAnsi="Arial Unicode MS" w:eastAsia="Arial Unicode MS" w:hint="eastAsia"/>
+                <w:sz w:val="17"/>
+              </w:rPr>
+              <w:t>结案后形成候选方法，经回放和人工审核后再复用</w:t>
+            </w:r>
+          </w:p>
+        </w:tc>
+        <w:tc>
+          <w:tcPr>
+            <w:tcW w:type="dxa" w:w="2592"/>
+            <w:tcMar>
+              <w:top w:w="80" w:type="dxa"/>
+              <w:start w:w="120" w:type="dxa"/>
+              <w:bottom w:w="80" w:type="dxa"/>
+              <w:end w:w="120" w:type="dxa"/>
+            </w:tcMar>
+            <w:vAlign w:val="top"/>
+          </w:tcPr>
+          <w:p>
+            <w:pPr>
+              <w:spacing w:after="0"/>
+            </w:pPr>
+            <w:r>
+              <w:rPr>
+                <w:rFonts w:ascii="Arial Unicode MS" w:hAnsi="Arial Unicode MS" w:eastAsia="Arial Unicode MS" w:hint="eastAsia"/>
+                <w:sz w:val="17"/>
+              </w:rPr>
+              <w:t>候选、回放和审核机制已实现</w:t>
+            </w:r>
+          </w:p>
+        </w:tc>
+      </w:tr>
+      <w:tr>
+        <w:tc>
+          <w:tcPr>
+            <w:tcW w:type="dxa" w:w="2088"/>
+            <w:tcMar>
+              <w:top w:w="80" w:type="dxa"/>
+              <w:start w:w="120" w:type="dxa"/>
+              <w:bottom w:w="80" w:type="dxa"/>
+              <w:end w:w="120" w:type="dxa"/>
+            </w:tcMar>
+            <w:vAlign w:val="top"/>
+          </w:tcPr>
+          <w:p>
+            <w:pPr>
+              <w:spacing w:after="0"/>
+            </w:pPr>
+            <w:r>
+              <w:rPr>
+                <w:rFonts w:ascii="Arial Unicode MS" w:hAnsi="Arial Unicode MS" w:eastAsia="Arial Unicode MS" w:hint="eastAsia"/>
+                <w:sz w:val="17"/>
+              </w:rPr>
+              <w:t>完全没有方法</w:t>
+            </w:r>
+          </w:p>
+        </w:tc>
+        <w:tc>
+          <w:tcPr>
+            <w:tcW w:type="dxa" w:w="4680"/>
+            <w:tcMar>
+              <w:top w:w="80" w:type="dxa"/>
+              <w:start w:w="120" w:type="dxa"/>
+              <w:bottom w:w="80" w:type="dxa"/>
+              <w:end w:w="120" w:type="dxa"/>
+            </w:tcMar>
+            <w:vAlign w:val="top"/>
+          </w:tcPr>
+          <w:p>
+            <w:pPr>
+              <w:spacing w:after="0"/>
+            </w:pPr>
+            <w:r>
+              <w:rPr>
+                <w:rFonts w:ascii="Arial Unicode MS" w:hAnsi="Arial Unicode MS" w:eastAsia="Arial Unicode MS" w:hint="eastAsia"/>
+                <w:sz w:val="17"/>
+              </w:rPr>
+              <w:t>只允许受限、只读的探索，无证据即停止</w:t>
+            </w:r>
+          </w:p>
+        </w:tc>
+        <w:tc>
+          <w:tcPr>
+            <w:tcW w:type="dxa" w:w="2592"/>
+            <w:tcMar>
+              <w:top w:w="80" w:type="dxa"/>
+              <w:start w:w="120" w:type="dxa"/>
+              <w:bottom w:w="80" w:type="dxa"/>
+              <w:end w:w="120" w:type="dxa"/>
+            </w:tcMar>
+            <w:vAlign w:val="top"/>
+          </w:tcPr>
+          <w:p>
+            <w:pPr>
+              <w:spacing w:after="0"/>
+            </w:pPr>
+            <w:r>
+              <w:rPr>
+                <w:rFonts w:ascii="Arial Unicode MS" w:hAnsi="Arial Unicode MS" w:eastAsia="Arial Unicode MS" w:hint="eastAsia"/>
+                <w:sz w:val="17"/>
+              </w:rPr>
+              <w:t>通用自主规划尚未通过投产验证</w:t>
+            </w:r>
+          </w:p>
+        </w:tc>
+      </w:tr>
+    </w:tbl>
+    <w:p>
+      <w:pPr>
+        <w:spacing w:after="40"/>
+      </w:pPr>
+    </w:p>
+    <w:p>
+      <w:pPr>
+        <w:pStyle w:val="Heading2"/>
+      </w:pPr>
+      <w:r>
+        <w:t>1.3 排障过程中的共性断点</w:t>
       </w:r>
     </w:p>
     <w:p>
@@ -1048,7 +1768,7 @@
         <w:pStyle w:val="Heading2"/>
       </w:pPr>
       <w:r>
-        <w:t>1.2 真实案例</w:t>
+        <w:t>1.4 真实案例</w:t>
       </w:r>
     </w:p>
     <w:tbl>
@@ -1476,6 +2196,544 @@
             </w:pPr>
             <w:r>
               <w:t>证据支持异常特征与故障有关，但生产处置与最终因果确认仍由授权负责人完成；平台不会把相关性包装成自动修复。</w:t>
+            </w:r>
+          </w:p>
+        </w:tc>
+      </w:tr>
+    </w:tbl>
+    <w:p>
+      <w:pPr>
+        <w:spacing w:after="40"/>
+      </w:pPr>
+    </w:p>
+    <w:p>
+      <w:pPr>
+        <w:pStyle w:val="Heading2"/>
+      </w:pPr>
+      <w:r>
+        <w:t>1.5 谁负责接入，开发怎么开始</w:t>
+      </w:r>
+    </w:p>
+    <w:p>
+      <w:pPr>
+        <w:spacing w:after="160"/>
+      </w:pPr>
+      <w:r>
+        <w:rPr>
+          <w:rFonts w:ascii="Arial Unicode MS" w:hAnsi="Arial Unicode MS" w:eastAsia="Arial Unicode MS" w:hint="eastAsia"/>
+          <w:b w:val="0"/>
+        </w:rPr>
+        <w:t>接入分成一次性准备与日常排障两条路径。平台管理员统一配置数据源，系统负责人维护本系统观测资产与查询规则；开发和值班人员日常只需要从告警创建排障单，不必自己编写 DQL。</w:t>
+      </w:r>
+    </w:p>
+    <w:tbl>
+      <w:tblPr>
+        <w:tblStyle w:val="TableGrid"/>
+        <w:tblW w:type="auto" w:w="0"/>
+        <w:jc w:val="center"/>
+        <w:tblLayout w:type="fixed"/>
+        <w:tblLook w:firstColumn="1" w:firstRow="1" w:lastColumn="0" w:lastRow="0" w:noHBand="0" w:noVBand="1" w:val="04A0"/>
+      </w:tblPr>
+      <w:tblGrid>
+        <w:gridCol w:w="3120"/>
+        <w:gridCol w:w="3120"/>
+        <w:gridCol w:w="3120"/>
+      </w:tblGrid>
+      <w:tr>
+        <w:trPr>
+          <w:tblHeader w:val="true"/>
+        </w:trPr>
+        <w:tc>
+          <w:tcPr>
+            <w:tcW w:type="dxa" w:w="1656"/>
+            <w:shd w:fill="F4F6F9"/>
+            <w:tcMar>
+              <w:top w:w="80" w:type="dxa"/>
+              <w:start w:w="120" w:type="dxa"/>
+              <w:bottom w:w="80" w:type="dxa"/>
+              <w:end w:w="120" w:type="dxa"/>
+            </w:tcMar>
+            <w:vAlign w:val="center"/>
+          </w:tcPr>
+          <w:p>
+            <w:pPr>
+              <w:jc w:val="left"/>
+            </w:pPr>
+            <w:r>
+              <w:rPr>
+                <w:b/>
+                <w:sz w:val="17"/>
+              </w:rPr>
+              <w:t>角色</w:t>
+            </w:r>
+          </w:p>
+        </w:tc>
+        <w:tc>
+          <w:tcPr>
+            <w:tcW w:type="dxa" w:w="2880"/>
+            <w:shd w:fill="F4F6F9"/>
+            <w:tcMar>
+              <w:top w:w="80" w:type="dxa"/>
+              <w:start w:w="120" w:type="dxa"/>
+              <w:bottom w:w="80" w:type="dxa"/>
+              <w:end w:w="120" w:type="dxa"/>
+            </w:tcMar>
+            <w:vAlign w:val="center"/>
+          </w:tcPr>
+          <w:p>
+            <w:pPr>
+              <w:jc w:val="left"/>
+            </w:pPr>
+            <w:r>
+              <w:rPr>
+                <w:b/>
+                <w:sz w:val="17"/>
+              </w:rPr>
+              <w:t>操作入口</w:t>
+            </w:r>
+          </w:p>
+        </w:tc>
+        <w:tc>
+          <w:tcPr>
+            <w:tcW w:type="dxa" w:w="4824"/>
+            <w:shd w:fill="F4F6F9"/>
+            <w:tcMar>
+              <w:top w:w="80" w:type="dxa"/>
+              <w:start w:w="120" w:type="dxa"/>
+              <w:bottom w:w="80" w:type="dxa"/>
+              <w:end w:w="120" w:type="dxa"/>
+            </w:tcMar>
+            <w:vAlign w:val="center"/>
+          </w:tcPr>
+          <w:p>
+            <w:pPr>
+              <w:jc w:val="left"/>
+            </w:pPr>
+            <w:r>
+              <w:rPr>
+                <w:b/>
+                <w:sz w:val="17"/>
+              </w:rPr>
+              <w:t>主要职责</w:t>
+            </w:r>
+          </w:p>
+        </w:tc>
+      </w:tr>
+      <w:tr>
+        <w:tc>
+          <w:tcPr>
+            <w:tcW w:type="dxa" w:w="1656"/>
+            <w:tcMar>
+              <w:top w:w="80" w:type="dxa"/>
+              <w:start w:w="120" w:type="dxa"/>
+              <w:bottom w:w="80" w:type="dxa"/>
+              <w:end w:w="120" w:type="dxa"/>
+            </w:tcMar>
+            <w:vAlign w:val="top"/>
+          </w:tcPr>
+          <w:p>
+            <w:pPr>
+              <w:spacing w:after="0"/>
+            </w:pPr>
+            <w:r>
+              <w:rPr>
+                <w:rFonts w:ascii="Arial Unicode MS" w:hAnsi="Arial Unicode MS" w:eastAsia="Arial Unicode MS" w:hint="eastAsia"/>
+                <w:sz w:val="17"/>
+              </w:rPr>
+              <w:t>平台管理员</w:t>
+            </w:r>
+          </w:p>
+        </w:tc>
+        <w:tc>
+          <w:tcPr>
+            <w:tcW w:type="dxa" w:w="2880"/>
+            <w:tcMar>
+              <w:top w:w="80" w:type="dxa"/>
+              <w:start w:w="120" w:type="dxa"/>
+              <w:bottom w:w="80" w:type="dxa"/>
+              <w:end w:w="120" w:type="dxa"/>
+            </w:tcMar>
+            <w:vAlign w:val="top"/>
+          </w:tcPr>
+          <w:p>
+            <w:pPr>
+              <w:spacing w:after="0"/>
+            </w:pPr>
+            <w:r>
+              <w:rPr>
+                <w:rFonts w:ascii="Arial Unicode MS" w:hAnsi="Arial Unicode MS" w:eastAsia="Arial Unicode MS" w:hint="eastAsia"/>
+                <w:sz w:val="17"/>
+              </w:rPr>
+              <w:t>取证接入 → 数据源联调</w:t>
+            </w:r>
+          </w:p>
+        </w:tc>
+        <w:tc>
+          <w:tcPr>
+            <w:tcW w:type="dxa" w:w="4824"/>
+            <w:tcMar>
+              <w:top w:w="80" w:type="dxa"/>
+              <w:start w:w="120" w:type="dxa"/>
+              <w:bottom w:w="80" w:type="dxa"/>
+              <w:end w:w="120" w:type="dxa"/>
+            </w:tcMar>
+            <w:vAlign w:val="top"/>
+          </w:tcPr>
+          <w:p>
+            <w:pPr>
+              <w:spacing w:after="0"/>
+            </w:pPr>
+            <w:r>
+              <w:rPr>
+                <w:rFonts w:ascii="Arial Unicode MS" w:hAnsi="Arial Unicode MS" w:eastAsia="Arial Unicode MS" w:hint="eastAsia"/>
+                <w:sz w:val="17"/>
+              </w:rPr>
+              <w:t>配置并验证 Guance 连接、认证、超时和只读边界；同一数据源统一配置</w:t>
+            </w:r>
+          </w:p>
+        </w:tc>
+      </w:tr>
+      <w:tr>
+        <w:tc>
+          <w:tcPr>
+            <w:tcW w:type="dxa" w:w="1656"/>
+            <w:tcMar>
+              <w:top w:w="80" w:type="dxa"/>
+              <w:start w:w="120" w:type="dxa"/>
+              <w:bottom w:w="80" w:type="dxa"/>
+              <w:end w:w="120" w:type="dxa"/>
+            </w:tcMar>
+            <w:vAlign w:val="top"/>
+          </w:tcPr>
+          <w:p>
+            <w:pPr>
+              <w:spacing w:after="0"/>
+            </w:pPr>
+            <w:r>
+              <w:rPr>
+                <w:rFonts w:ascii="Arial Unicode MS" w:hAnsi="Arial Unicode MS" w:eastAsia="Arial Unicode MS" w:hint="eastAsia"/>
+                <w:sz w:val="17"/>
+              </w:rPr>
+              <w:t>系统负责人</w:t>
+            </w:r>
+          </w:p>
+        </w:tc>
+        <w:tc>
+          <w:tcPr>
+            <w:tcW w:type="dxa" w:w="2880"/>
+            <w:tcMar>
+              <w:top w:w="80" w:type="dxa"/>
+              <w:start w:w="120" w:type="dxa"/>
+              <w:bottom w:w="80" w:type="dxa"/>
+              <w:end w:w="120" w:type="dxa"/>
+            </w:tcMar>
+            <w:vAlign w:val="top"/>
+          </w:tcPr>
+          <w:p>
+            <w:pPr>
+              <w:spacing w:after="0"/>
+            </w:pPr>
+            <w:r>
+              <w:rPr>
+                <w:rFonts w:ascii="Arial Unicode MS" w:hAnsi="Arial Unicode MS" w:eastAsia="Arial Unicode MS" w:hint="eastAsia"/>
+                <w:sz w:val="17"/>
+              </w:rPr>
+              <w:t>系统与模块、查询规则</w:t>
+            </w:r>
+          </w:p>
+        </w:tc>
+        <w:tc>
+          <w:tcPr>
+            <w:tcW w:type="dxa" w:w="4824"/>
+            <w:tcMar>
+              <w:top w:w="80" w:type="dxa"/>
+              <w:start w:w="120" w:type="dxa"/>
+              <w:bottom w:w="80" w:type="dxa"/>
+              <w:end w:w="120" w:type="dxa"/>
+            </w:tcMar>
+            <w:vAlign w:val="top"/>
+          </w:tcPr>
+          <w:p>
+            <w:pPr>
+              <w:spacing w:after="0"/>
+            </w:pPr>
+            <w:r>
+              <w:rPr>
+                <w:rFonts w:ascii="Arial Unicode MS" w:hAnsi="Arial Unicode MS" w:eastAsia="Arial Unicode MS" w:hint="eastAsia"/>
+                <w:sz w:val="17"/>
+              </w:rPr>
+              <w:t>登记系统、服务和环境，维护失败、关联日志与正常对照规则</w:t>
+            </w:r>
+          </w:p>
+        </w:tc>
+      </w:tr>
+      <w:tr>
+        <w:tc>
+          <w:tcPr>
+            <w:tcW w:type="dxa" w:w="1656"/>
+            <w:tcMar>
+              <w:top w:w="80" w:type="dxa"/>
+              <w:start w:w="120" w:type="dxa"/>
+              <w:bottom w:w="80" w:type="dxa"/>
+              <w:end w:w="120" w:type="dxa"/>
+            </w:tcMar>
+            <w:vAlign w:val="top"/>
+          </w:tcPr>
+          <w:p>
+            <w:pPr>
+              <w:spacing w:after="0"/>
+            </w:pPr>
+            <w:r>
+              <w:rPr>
+                <w:rFonts w:ascii="Arial Unicode MS" w:hAnsi="Arial Unicode MS" w:eastAsia="Arial Unicode MS" w:hint="eastAsia"/>
+                <w:sz w:val="17"/>
+              </w:rPr>
+              <w:t>审核负责人</w:t>
+            </w:r>
+          </w:p>
+        </w:tc>
+        <w:tc>
+          <w:tcPr>
+            <w:tcW w:type="dxa" w:w="2880"/>
+            <w:tcMar>
+              <w:top w:w="80" w:type="dxa"/>
+              <w:start w:w="120" w:type="dxa"/>
+              <w:bottom w:w="80" w:type="dxa"/>
+              <w:end w:w="120" w:type="dxa"/>
+            </w:tcMar>
+            <w:vAlign w:val="top"/>
+          </w:tcPr>
+          <w:p>
+            <w:pPr>
+              <w:spacing w:after="0"/>
+            </w:pPr>
+            <w:r>
+              <w:rPr>
+                <w:rFonts w:ascii="Arial Unicode MS" w:hAnsi="Arial Unicode MS" w:eastAsia="Arial Unicode MS" w:hint="eastAsia"/>
+                <w:sz w:val="17"/>
+              </w:rPr>
+              <w:t>排障规则库、路由与绑定</w:t>
+            </w:r>
+          </w:p>
+        </w:tc>
+        <w:tc>
+          <w:tcPr>
+            <w:tcW w:type="dxa" w:w="4824"/>
+            <w:tcMar>
+              <w:top w:w="80" w:type="dxa"/>
+              <w:start w:w="120" w:type="dxa"/>
+              <w:bottom w:w="80" w:type="dxa"/>
+              <w:end w:w="120" w:type="dxa"/>
+            </w:tcMar>
+            <w:vAlign w:val="top"/>
+          </w:tcPr>
+          <w:p>
+            <w:pPr>
+              <w:spacing w:after="0"/>
+            </w:pPr>
+            <w:r>
+              <w:rPr>
+                <w:rFonts w:ascii="Arial Unicode MS" w:hAnsi="Arial Unicode MS" w:eastAsia="Arial Unicode MS" w:hint="eastAsia"/>
+                <w:sz w:val="17"/>
+              </w:rPr>
+              <w:t>完成只读试跑、回放、规则审核和版本启用</w:t>
+            </w:r>
+          </w:p>
+        </w:tc>
+      </w:tr>
+      <w:tr>
+        <w:tc>
+          <w:tcPr>
+            <w:tcW w:type="dxa" w:w="1656"/>
+            <w:tcMar>
+              <w:top w:w="80" w:type="dxa"/>
+              <w:start w:w="120" w:type="dxa"/>
+              <w:bottom w:w="80" w:type="dxa"/>
+              <w:end w:w="120" w:type="dxa"/>
+            </w:tcMar>
+            <w:vAlign w:val="top"/>
+          </w:tcPr>
+          <w:p>
+            <w:pPr>
+              <w:spacing w:after="0"/>
+            </w:pPr>
+            <w:r>
+              <w:rPr>
+                <w:rFonts w:ascii="Arial Unicode MS" w:hAnsi="Arial Unicode MS" w:eastAsia="Arial Unicode MS" w:hint="eastAsia"/>
+                <w:sz w:val="17"/>
+              </w:rPr>
+              <w:t>开发 / 值班</w:t>
+            </w:r>
+          </w:p>
+        </w:tc>
+        <w:tc>
+          <w:tcPr>
+            <w:tcW w:type="dxa" w:w="2880"/>
+            <w:tcMar>
+              <w:top w:w="80" w:type="dxa"/>
+              <w:start w:w="120" w:type="dxa"/>
+              <w:bottom w:w="80" w:type="dxa"/>
+              <w:end w:w="120" w:type="dxa"/>
+            </w:tcMar>
+            <w:vAlign w:val="top"/>
+          </w:tcPr>
+          <w:p>
+            <w:pPr>
+              <w:spacing w:after="0"/>
+            </w:pPr>
+            <w:r>
+              <w:rPr>
+                <w:rFonts w:ascii="Arial Unicode MS" w:hAnsi="Arial Unicode MS" w:eastAsia="Arial Unicode MS" w:hint="eastAsia"/>
+                <w:sz w:val="17"/>
+              </w:rPr>
+              <w:t>智能排障 → 排障工作台</w:t>
+            </w:r>
+          </w:p>
+        </w:tc>
+        <w:tc>
+          <w:tcPr>
+            <w:tcW w:type="dxa" w:w="4824"/>
+            <w:tcMar>
+              <w:top w:w="80" w:type="dxa"/>
+              <w:start w:w="120" w:type="dxa"/>
+              <w:bottom w:w="80" w:type="dxa"/>
+              <w:end w:w="120" w:type="dxa"/>
+            </w:tcMar>
+            <w:vAlign w:val="top"/>
+          </w:tcPr>
+          <w:p>
+            <w:pPr>
+              <w:spacing w:after="0"/>
+            </w:pPr>
+            <w:r>
+              <w:rPr>
+                <w:rFonts w:ascii="Arial Unicode MS" w:hAnsi="Arial Unicode MS" w:eastAsia="Arial Unicode MS" w:hint="eastAsia"/>
+                <w:sz w:val="17"/>
+              </w:rPr>
+              <w:t>从告警创建排障单，查看证据，确认、驳回或转人工</w:t>
+            </w:r>
+          </w:p>
+        </w:tc>
+      </w:tr>
+    </w:tbl>
+    <w:p>
+      <w:pPr>
+        <w:spacing w:after="40"/>
+      </w:pPr>
+    </w:p>
+    <w:p>
+      <w:pPr>
+        <w:pStyle w:val="Heading3"/>
+      </w:pPr>
+      <w:r>
+        <w:t>开发的五步使用路径</w:t>
+      </w:r>
+    </w:p>
+    <w:p>
+      <w:pPr>
+        <w:spacing w:after="80"/>
+        <w:ind w:left="360" w:hanging="360"/>
+      </w:pPr>
+      <w:r>
+        <w:rPr>
+          <w:rFonts w:ascii="Arial Unicode MS" w:hAnsi="Arial Unicode MS" w:eastAsia="Arial Unicode MS" w:hint="eastAsia"/>
+          <w:b w:val="0"/>
+        </w:rPr>
+        <w:t>1. 收到告警后进入排障工作台，点击创建排障单。</w:t>
+      </w:r>
+    </w:p>
+    <w:p>
+      <w:pPr>
+        <w:spacing w:after="80"/>
+        <w:ind w:left="360" w:hanging="360"/>
+      </w:pPr>
+      <w:r>
+        <w:rPr>
+          <w:rFonts w:ascii="Arial Unicode MS" w:hAnsi="Arial Unicode MS" w:eastAsia="Arial Unicode MS" w:hint="eastAsia"/>
+          <w:b w:val="0"/>
+        </w:rPr>
+        <w:t>2. 填写系统、服务、精确告警时间、错误码和故障现象。</w:t>
+      </w:r>
+    </w:p>
+    <w:p>
+      <w:pPr>
+        <w:spacing w:after="80"/>
+        <w:ind w:left="360" w:hanging="360"/>
+      </w:pPr>
+      <w:r>
+        <w:rPr>
+          <w:rFonts w:ascii="Arial Unicode MS" w:hAnsi="Arial Unicode MS" w:eastAsia="Arial Unicode MS" w:hint="eastAsia"/>
+          <w:b w:val="0"/>
+        </w:rPr>
+        <w:t>3. 系统自动选择已审核方法并执行只读取证，开发不需要编写 DQL。</w:t>
+      </w:r>
+    </w:p>
+    <w:p>
+      <w:pPr>
+        <w:spacing w:after="80"/>
+        <w:ind w:left="360" w:hanging="360"/>
+      </w:pPr>
+      <w:r>
+        <w:rPr>
+          <w:rFonts w:ascii="Arial Unicode MS" w:hAnsi="Arial Unicode MS" w:eastAsia="Arial Unicode MS" w:hint="eastAsia"/>
+          <w:b w:val="0"/>
+        </w:rPr>
+        <w:t>4. 详情页先看结论，需要复核时再看关键节点、完整过程和证据关系。</w:t>
+      </w:r>
+    </w:p>
+    <w:p>
+      <w:pPr>
+        <w:spacing w:after="80"/>
+        <w:ind w:left="360" w:hanging="360"/>
+      </w:pPr>
+      <w:r>
+        <w:rPr>
+          <w:rFonts w:ascii="Arial Unicode MS" w:hAnsi="Arial Unicode MS" w:eastAsia="Arial Unicode MS" w:hint="eastAsia"/>
+          <w:b w:val="0"/>
+        </w:rPr>
+        <w:t>5. 负责人确认或驳回，在平台外完成生产处置并登记结果。</w:t>
+      </w:r>
+    </w:p>
+    <w:tbl>
+      <w:tblPr>
+        <w:tblW w:type="auto" w:w="0"/>
+        <w:jc w:val="center"/>
+        <w:tblLayout w:type="fixed"/>
+        <w:tblLook w:firstColumn="1" w:firstRow="1" w:lastColumn="0" w:lastRow="0" w:noHBand="0" w:noVBand="1" w:val="04A0"/>
+      </w:tblPr>
+      <w:tblGrid>
+        <w:gridCol w:w="9360"/>
+      </w:tblGrid>
+      <w:tr>
+        <w:tc>
+          <w:tcPr>
+            <w:tcW w:type="dxa" w:w="9360"/>
+            <w:shd w:fill="F4F6F9"/>
+            <w:tcMar>
+              <w:top w:w="150" w:type="dxa"/>
+              <w:start w:w="180" w:type="dxa"/>
+              <w:bottom w:w="150" w:type="dxa"/>
+              <w:end w:w="180" w:type="dxa"/>
+            </w:tcMar>
+          </w:tcPr>
+          <w:p>
+            <w:pPr>
+              <w:spacing w:after="80"/>
+            </w:pPr>
+            <w:r>
+              <w:rPr>
+                <w:b/>
+                <w:color w:val="2E74B5"/>
+              </w:rPr>
+              <w:t>无法自动调查时怎么办</w:t>
+            </w:r>
+          </w:p>
+          <w:p>
+            <w:pPr>
+              <w:spacing w:after="0"/>
+            </w:pPr>
+            <w:r>
+              <w:t>系统未接入、规则未审核或真实证据不可用时，平台会明确显示配置缺口或“证据不足”，并转回人工排障；不会用 Demo、历史猜测或模型回答替代真实证据。</w:t>
             </w:r>
           </w:p>
         </w:tc>
@@ -3568,6 +4826,385 @@
         <w:t>当前真实记录：三次 Guance-only 查询取得规范化证据；系统调查阶段约 4 秒；2 个失败请求均出现异常特征，36 个正常请求均未出现；2 条确定性判断条件成立。</w:t>
       </w:r>
     </w:p>
+    <w:tbl>
+      <w:tblPr>
+        <w:tblW w:type="auto" w:w="0"/>
+        <w:jc w:val="center"/>
+        <w:tblLayout w:type="fixed"/>
+        <w:tblLook w:firstColumn="1" w:firstRow="1" w:lastColumn="0" w:lastRow="0" w:noHBand="0" w:noVBand="1" w:val="04A0"/>
+      </w:tblPr>
+      <w:tblGrid>
+        <w:gridCol w:w="9360"/>
+      </w:tblGrid>
+      <w:tr>
+        <w:tc>
+          <w:tcPr>
+            <w:tcW w:type="dxa" w:w="9360"/>
+            <w:shd w:fill="F8EEE7"/>
+            <w:tcMar>
+              <w:top w:w="150" w:type="dxa"/>
+              <w:start w:w="180" w:type="dxa"/>
+              <w:bottom w:w="150" w:type="dxa"/>
+              <w:end w:w="180" w:type="dxa"/>
+            </w:tcMar>
+          </w:tcPr>
+          <w:p>
+            <w:pPr>
+              <w:spacing w:after="80"/>
+            </w:pPr>
+            <w:r>
+              <w:rPr>
+                <w:b/>
+                <w:color w:val="DD704B"/>
+              </w:rPr>
+              <w:t>4 秒证明了什么</w:t>
+            </w:r>
+          </w:p>
+          <w:p>
+            <w:pPr>
+              <w:spacing w:after="0"/>
+            </w:pPr>
+            <w:r>
+              <w:t>它只证明这条已审核方法能在真实 Guance 数据上完成一次系统调查，不等于已证明二线独立排障、三线快速上手和重大故障收敛效率。</w:t>
+            </w:r>
+          </w:p>
+        </w:tc>
+      </w:tr>
+    </w:tbl>
+    <w:p>
+      <w:pPr>
+        <w:spacing w:after="40"/>
+      </w:pPr>
+    </w:p>
+    <w:p>
+      <w:pPr>
+        <w:pStyle w:val="Heading2"/>
+      </w:pPr>
+      <w:r>
+        <w:t>三个问题的效果验收</w:t>
+      </w:r>
+    </w:p>
+    <w:tbl>
+      <w:tblPr>
+        <w:tblStyle w:val="TableGrid"/>
+        <w:tblW w:type="auto" w:w="0"/>
+        <w:jc w:val="center"/>
+        <w:tblLayout w:type="fixed"/>
+        <w:tblLook w:firstColumn="1" w:firstRow="1" w:lastColumn="0" w:lastRow="0" w:noHBand="0" w:noVBand="1" w:val="04A0"/>
+      </w:tblPr>
+      <w:tblGrid>
+        <w:gridCol w:w="3120"/>
+        <w:gridCol w:w="3120"/>
+        <w:gridCol w:w="3120"/>
+      </w:tblGrid>
+      <w:tr>
+        <w:trPr>
+          <w:tblHeader w:val="true"/>
+        </w:trPr>
+        <w:tc>
+          <w:tcPr>
+            <w:tcW w:type="dxa" w:w="2304"/>
+            <w:shd w:fill="F4F6F9"/>
+            <w:tcMar>
+              <w:top w:w="80" w:type="dxa"/>
+              <w:start w:w="120" w:type="dxa"/>
+              <w:bottom w:w="80" w:type="dxa"/>
+              <w:end w:w="120" w:type="dxa"/>
+            </w:tcMar>
+            <w:vAlign w:val="center"/>
+          </w:tcPr>
+          <w:p>
+            <w:pPr>
+              <w:jc w:val="left"/>
+            </w:pPr>
+            <w:r>
+              <w:rPr>
+                <w:b/>
+                <w:sz w:val="17"/>
+              </w:rPr>
+              <w:t>要验证的问题</w:t>
+            </w:r>
+          </w:p>
+        </w:tc>
+        <w:tc>
+          <w:tcPr>
+            <w:tcW w:type="dxa" w:w="3960"/>
+            <w:shd w:fill="F4F6F9"/>
+            <w:tcMar>
+              <w:top w:w="80" w:type="dxa"/>
+              <w:start w:w="120" w:type="dxa"/>
+              <w:bottom w:w="80" w:type="dxa"/>
+              <w:end w:w="120" w:type="dxa"/>
+            </w:tcMar>
+            <w:vAlign w:val="center"/>
+          </w:tcPr>
+          <w:p>
+            <w:pPr>
+              <w:jc w:val="left"/>
+            </w:pPr>
+            <w:r>
+              <w:rPr>
+                <w:b/>
+                <w:sz w:val="17"/>
+              </w:rPr>
+              <w:t>真实试用方式</w:t>
+            </w:r>
+          </w:p>
+        </w:tc>
+        <w:tc>
+          <w:tcPr>
+            <w:tcW w:type="dxa" w:w="3096"/>
+            <w:shd w:fill="F4F6F9"/>
+            <w:tcMar>
+              <w:top w:w="80" w:type="dxa"/>
+              <w:start w:w="120" w:type="dxa"/>
+              <w:bottom w:w="80" w:type="dxa"/>
+              <w:end w:w="120" w:type="dxa"/>
+            </w:tcMar>
+            <w:vAlign w:val="center"/>
+          </w:tcPr>
+          <w:p>
+            <w:pPr>
+              <w:jc w:val="left"/>
+            </w:pPr>
+            <w:r>
+              <w:rPr>
+                <w:b/>
+                <w:sz w:val="17"/>
+              </w:rPr>
+              <w:t>主要指标</w:t>
+            </w:r>
+          </w:p>
+        </w:tc>
+      </w:tr>
+      <w:tr>
+        <w:tc>
+          <w:tcPr>
+            <w:tcW w:type="dxa" w:w="2304"/>
+            <w:tcMar>
+              <w:top w:w="80" w:type="dxa"/>
+              <w:start w:w="120" w:type="dxa"/>
+              <w:bottom w:w="80" w:type="dxa"/>
+              <w:end w:w="120" w:type="dxa"/>
+            </w:tcMar>
+            <w:vAlign w:val="top"/>
+          </w:tcPr>
+          <w:p>
+            <w:pPr>
+              <w:spacing w:after="0"/>
+            </w:pPr>
+            <w:r>
+              <w:rPr>
+                <w:rFonts w:ascii="Arial Unicode MS" w:hAnsi="Arial Unicode MS" w:eastAsia="Arial Unicode MS" w:hint="eastAsia"/>
+                <w:sz w:val="17"/>
+              </w:rPr>
+              <w:t>二线能基于平台排障</w:t>
+            </w:r>
+          </w:p>
+        </w:tc>
+        <w:tc>
+          <w:tcPr>
+            <w:tcW w:type="dxa" w:w="3960"/>
+            <w:tcMar>
+              <w:top w:w="80" w:type="dxa"/>
+              <w:start w:w="120" w:type="dxa"/>
+              <w:bottom w:w="80" w:type="dxa"/>
+              <w:end w:w="120" w:type="dxa"/>
+            </w:tcMar>
+            <w:vAlign w:val="top"/>
+          </w:tcPr>
+          <w:p>
+            <w:pPr>
+              <w:spacing w:after="0"/>
+            </w:pPr>
+            <w:r>
+              <w:rPr>
+                <w:rFonts w:ascii="Arial Unicode MS" w:hAnsi="Arial Unicode MS" w:eastAsia="Arial Unicode MS" w:hint="eastAsia"/>
+                <w:sz w:val="17"/>
+              </w:rPr>
+              <w:t>让二线人员不由三线代操，独立处理已审核场景</w:t>
+            </w:r>
+          </w:p>
+        </w:tc>
+        <w:tc>
+          <w:tcPr>
+            <w:tcW w:type="dxa" w:w="3096"/>
+            <w:tcMar>
+              <w:top w:w="80" w:type="dxa"/>
+              <w:start w:w="120" w:type="dxa"/>
+              <w:bottom w:w="80" w:type="dxa"/>
+              <w:end w:w="120" w:type="dxa"/>
+            </w:tcMar>
+            <w:vAlign w:val="top"/>
+          </w:tcPr>
+          <w:p>
+            <w:pPr>
+              <w:spacing w:after="0"/>
+            </w:pPr>
+            <w:r>
+              <w:rPr>
+                <w:rFonts w:ascii="Arial Unicode MS" w:hAnsi="Arial Unicode MS" w:eastAsia="Arial Unicode MS" w:hint="eastAsia"/>
+                <w:sz w:val="17"/>
+              </w:rPr>
+              <w:t>独立完成率、升级比例、首个可读结论耗时</w:t>
+            </w:r>
+          </w:p>
+        </w:tc>
+      </w:tr>
+      <w:tr>
+        <w:tc>
+          <w:tcPr>
+            <w:tcW w:type="dxa" w:w="2304"/>
+            <w:tcMar>
+              <w:top w:w="80" w:type="dxa"/>
+              <w:start w:w="120" w:type="dxa"/>
+              <w:bottom w:w="80" w:type="dxa"/>
+              <w:end w:w="120" w:type="dxa"/>
+            </w:tcMar>
+            <w:vAlign w:val="top"/>
+          </w:tcPr>
+          <w:p>
+            <w:pPr>
+              <w:spacing w:after="0"/>
+            </w:pPr>
+            <w:r>
+              <w:rPr>
+                <w:rFonts w:ascii="Arial Unicode MS" w:hAnsi="Arial Unicode MS" w:eastAsia="Arial Unicode MS" w:hint="eastAsia"/>
+                <w:sz w:val="17"/>
+              </w:rPr>
+              <w:t>三线开发能快速上手</w:t>
+            </w:r>
+          </w:p>
+        </w:tc>
+        <w:tc>
+          <w:tcPr>
+            <w:tcW w:type="dxa" w:w="3960"/>
+            <w:tcMar>
+              <w:top w:w="80" w:type="dxa"/>
+              <w:start w:w="120" w:type="dxa"/>
+              <w:bottom w:w="80" w:type="dxa"/>
+              <w:end w:w="120" w:type="dxa"/>
+            </w:tcMar>
+            <w:vAlign w:val="top"/>
+          </w:tcPr>
+          <w:p>
+            <w:pPr>
+              <w:spacing w:after="0"/>
+            </w:pPr>
+            <w:r>
+              <w:rPr>
+                <w:rFonts w:ascii="Arial Unicode MS" w:hAnsi="Arial Unicode MS" w:eastAsia="Arial Unicode MS" w:hint="eastAsia"/>
+                <w:sz w:val="17"/>
+              </w:rPr>
+              <w:t>让不熟悉该系统的开发完成同一批排障任务</w:t>
+            </w:r>
+          </w:p>
+        </w:tc>
+        <w:tc>
+          <w:tcPr>
+            <w:tcW w:type="dxa" w:w="3096"/>
+            <w:tcMar>
+              <w:top w:w="80" w:type="dxa"/>
+              <w:start w:w="120" w:type="dxa"/>
+              <w:bottom w:w="80" w:type="dxa"/>
+              <w:end w:w="120" w:type="dxa"/>
+            </w:tcMar>
+            <w:vAlign w:val="top"/>
+          </w:tcPr>
+          <w:p>
+            <w:pPr>
+              <w:spacing w:after="0"/>
+            </w:pPr>
+            <w:r>
+              <w:rPr>
+                <w:rFonts w:ascii="Arial Unicode MS" w:hAnsi="Arial Unicode MS" w:eastAsia="Arial Unicode MS" w:hint="eastAsia"/>
+                <w:sz w:val="17"/>
+              </w:rPr>
+              <w:t>首次排障耗时、求助次数、证据完整度</w:t>
+            </w:r>
+          </w:p>
+        </w:tc>
+      </w:tr>
+      <w:tr>
+        <w:tc>
+          <w:tcPr>
+            <w:tcW w:type="dxa" w:w="2304"/>
+            <w:tcMar>
+              <w:top w:w="80" w:type="dxa"/>
+              <w:start w:w="120" w:type="dxa"/>
+              <w:bottom w:w="80" w:type="dxa"/>
+              <w:end w:w="120" w:type="dxa"/>
+            </w:tcMar>
+            <w:vAlign w:val="top"/>
+          </w:tcPr>
+          <w:p>
+            <w:pPr>
+              <w:spacing w:after="0"/>
+            </w:pPr>
+            <w:r>
+              <w:rPr>
+                <w:rFonts w:ascii="Arial Unicode MS" w:hAnsi="Arial Unicode MS" w:eastAsia="Arial Unicode MS" w:hint="eastAsia"/>
+                <w:sz w:val="17"/>
+              </w:rPr>
+              <w:t>重大故障能更快收敛</w:t>
+            </w:r>
+          </w:p>
+        </w:tc>
+        <w:tc>
+          <w:tcPr>
+            <w:tcW w:type="dxa" w:w="3960"/>
+            <w:tcMar>
+              <w:top w:w="80" w:type="dxa"/>
+              <w:start w:w="120" w:type="dxa"/>
+              <w:bottom w:w="80" w:type="dxa"/>
+              <w:end w:w="120" w:type="dxa"/>
+            </w:tcMar>
+            <w:vAlign w:val="top"/>
+          </w:tcPr>
+          <w:p>
+            <w:pPr>
+              <w:spacing w:after="0"/>
+            </w:pPr>
+            <w:r>
+              <w:rPr>
+                <w:rFonts w:ascii="Arial Unicode MS" w:hAnsi="Arial Unicode MS" w:eastAsia="Arial Unicode MS" w:hint="eastAsia"/>
+                <w:sz w:val="17"/>
+              </w:rPr>
+              <w:t>在真实演练或历史复盘中让多角色共用同一证据链</w:t>
+            </w:r>
+          </w:p>
+        </w:tc>
+        <w:tc>
+          <w:tcPr>
+            <w:tcW w:type="dxa" w:w="3096"/>
+            <w:tcMar>
+              <w:top w:w="80" w:type="dxa"/>
+              <w:start w:w="120" w:type="dxa"/>
+              <w:bottom w:w="80" w:type="dxa"/>
+              <w:end w:w="120" w:type="dxa"/>
+            </w:tcMar>
+            <w:vAlign w:val="top"/>
+          </w:tcPr>
+          <w:p>
+            <w:pPr>
+              <w:spacing w:after="0"/>
+            </w:pPr>
+            <w:r>
+              <w:rPr>
+                <w:rFonts w:ascii="Arial Unicode MS" w:hAnsi="Arial Unicode MS" w:eastAsia="Arial Unicode MS" w:hint="eastAsia"/>
+                <w:sz w:val="17"/>
+              </w:rPr>
+              <w:t>范围收敛耗时、重复查询数、无效转交数</w:t>
+            </w:r>
+          </w:p>
+        </w:tc>
+      </w:tr>
+    </w:tbl>
+    <w:p>
+      <w:pPr>
+        <w:spacing w:after="40"/>
+      </w:pPr>
+    </w:p>
     <w:p>
       <w:pPr>
         <w:spacing w:after="160"/>
@@ -3579,7 +5216,7 @@
           <w:color w:val="6F665F"/>
           <w:sz w:val="19"/>
         </w:rPr>
-        <w:t>以上是一条案例记录，不代表所有系统的平均效率。正式效能结论要在 20–30 条历史样本上统计补问、系统调查和人工采纳三个阶段的 p50/p95。</w:t>
+        <w:t>以上人员效果指标尚待真实试用。此外，仍需在 20–30 条历史样本上统计补问、系统调查和人工采纳三个阶段的 p50/p95。</w:t>
       </w:r>
     </w:p>
     <w:p>
@@ -4085,7 +5722,7 @@
               <w:spacing w:after="0"/>
             </w:pPr>
             <w:r>
-              <w:t>MateClaw 让开发更快看到系统查了什么、为什么得出这个判断、什么情况下会停止，并让一次真实排障变成下一次可审核、可重复执行的组织能力。</w:t>
+              <w:t>MateClaw 让二线能基于平台启动和推进标准化排障，让三线开发降低进入陌生系统调查的前置门槛，让重大故障团队围绕同一份证据快速收敛范围；并让一次真实排障变成下一次可审核、可重复执行的组织能力。</w:t>
             </w:r>
           </w:p>
         </w:tc>
@@ -4204,7 +5841,7 @@
               <w:color w:val="6F665F"/>
               <w:sz w:val="16"/>
             </w:rPr>
-            <w:t>作品方案 · 2026-08-10</w:t>
+            <w:t>作品方案 · 2026-08-11</w:t>
           </w:r>
         </w:p>
       </w:tc>

</xml_diff>